<commit_message>
updated data analysis report
</commit_message>
<xml_diff>
--- a/Exploratory Data Analysis Report - Casks Auctions.docx
+++ b/Exploratory Data Analysis Report - Casks Auctions.docx
@@ -98,27 +98,7 @@
           <w:szCs w:val="24"/>
           <w:lang w:val="en-US"/>
         </w:rPr>
-        <w:t xml:space="preserve">2 years of experience in data science/analysis roles. Currently working as data analyst at FIESC and as data science freelancer at </w:t>
-      </w:r>
-      <w:proofErr w:type="spellStart"/>
-      <w:r>
-        <w:rPr>
-          <w:rFonts w:ascii="Times New Roman" w:hAnsi="Times New Roman" w:cs="Times New Roman"/>
-          <w:sz w:val="24"/>
-          <w:szCs w:val="24"/>
-          <w:lang w:val="en-US"/>
-        </w:rPr>
-        <w:t>Whiskystats</w:t>
-      </w:r>
-      <w:proofErr w:type="spellEnd"/>
-      <w:r>
-        <w:rPr>
-          <w:rFonts w:ascii="Times New Roman" w:hAnsi="Times New Roman" w:cs="Times New Roman"/>
-          <w:sz w:val="24"/>
-          <w:szCs w:val="24"/>
-          <w:lang w:val="en-US"/>
-        </w:rPr>
-        <w:t>.</w:t>
+        <w:t>2 years of experience in data science/analysis roles. Currently working as data analyst at FIESC and as data science freelancer at Whiskystats.</w:t>
       </w:r>
     </w:p>
     <w:p>
@@ -538,27 +518,7 @@
           <w:szCs w:val="24"/>
           <w:lang w:val="en-US"/>
         </w:rPr>
-        <w:t xml:space="preserve">RLA and bulk </w:t>
-      </w:r>
-      <w:proofErr w:type="spellStart"/>
-      <w:r>
-        <w:rPr>
-          <w:rFonts w:ascii="Times New Roman" w:hAnsi="Times New Roman" w:cs="Times New Roman"/>
-          <w:sz w:val="24"/>
-          <w:szCs w:val="24"/>
-          <w:lang w:val="en-US"/>
-        </w:rPr>
-        <w:t>litres</w:t>
-      </w:r>
-      <w:proofErr w:type="spellEnd"/>
-      <w:r>
-        <w:rPr>
-          <w:rFonts w:ascii="Times New Roman" w:hAnsi="Times New Roman" w:cs="Times New Roman"/>
-          <w:sz w:val="24"/>
-          <w:szCs w:val="24"/>
-          <w:lang w:val="en-US"/>
-        </w:rPr>
-        <w:t xml:space="preserve"> and bottles at cask strength</w:t>
+        <w:t>RLA and bulk litres and bottles at cask strength</w:t>
       </w:r>
       <w:r>
         <w:rPr>
@@ -1059,27 +1019,7 @@
           <w:szCs w:val="24"/>
           <w:lang w:val="en-US"/>
         </w:rPr>
-        <w:t xml:space="preserve">Macallan and </w:t>
-      </w:r>
-      <w:proofErr w:type="spellStart"/>
-      <w:r>
-        <w:rPr>
-          <w:rFonts w:ascii="Times New Roman" w:hAnsi="Times New Roman" w:cs="Times New Roman"/>
-          <w:sz w:val="24"/>
-          <w:szCs w:val="24"/>
-          <w:lang w:val="en-US"/>
-        </w:rPr>
-        <w:t>Springbank</w:t>
-      </w:r>
-      <w:proofErr w:type="spellEnd"/>
-      <w:r>
-        <w:rPr>
-          <w:rFonts w:ascii="Times New Roman" w:hAnsi="Times New Roman" w:cs="Times New Roman"/>
-          <w:sz w:val="24"/>
-          <w:szCs w:val="24"/>
-          <w:lang w:val="en-US"/>
-        </w:rPr>
-        <w:t xml:space="preserve"> have an average price higher than the other distilleries.</w:t>
+        <w:t>Macallan and Springbank have an average price higher than the other distilleries.</w:t>
       </w:r>
     </w:p>
     <w:p>
@@ -1274,6 +1214,7 @@
       <w:r>
         <w:rPr>
           <w:rFonts w:ascii="Times New Roman" w:hAnsi="Times New Roman" w:cs="Times New Roman"/>
+          <w:noProof/>
           <w:sz w:val="24"/>
           <w:szCs w:val="24"/>
           <w:lang w:val="en-US"/>
@@ -1342,97 +1283,7 @@
           <w:szCs w:val="24"/>
           <w:lang w:val="en-US"/>
         </w:rPr>
-        <w:t xml:space="preserve">Regarding the </w:t>
-      </w:r>
-      <w:r>
-        <w:rPr>
-          <w:rFonts w:ascii="Times New Roman" w:hAnsi="Times New Roman" w:cs="Times New Roman"/>
-          <w:sz w:val="24"/>
-          <w:szCs w:val="24"/>
-          <w:lang w:val="en-US"/>
-        </w:rPr>
-        <w:t>cask filling</w:t>
-      </w:r>
-      <w:r>
-        <w:rPr>
-          <w:rFonts w:ascii="Times New Roman" w:hAnsi="Times New Roman" w:cs="Times New Roman"/>
-          <w:sz w:val="24"/>
-          <w:szCs w:val="24"/>
-          <w:lang w:val="en-US"/>
-        </w:rPr>
-        <w:t xml:space="preserve">, </w:t>
-      </w:r>
-      <w:r>
-        <w:rPr>
-          <w:rFonts w:ascii="Times New Roman" w:hAnsi="Times New Roman" w:cs="Times New Roman"/>
-          <w:sz w:val="24"/>
-          <w:szCs w:val="24"/>
-          <w:lang w:val="en-US"/>
-        </w:rPr>
-        <w:t>second fill</w:t>
-      </w:r>
-      <w:r>
-        <w:rPr>
-          <w:rFonts w:ascii="Times New Roman" w:hAnsi="Times New Roman" w:cs="Times New Roman"/>
-          <w:sz w:val="24"/>
-          <w:szCs w:val="24"/>
-          <w:lang w:val="en-US"/>
-        </w:rPr>
-        <w:t xml:space="preserve"> </w:t>
-      </w:r>
-      <w:r>
-        <w:rPr>
-          <w:rFonts w:ascii="Times New Roman" w:hAnsi="Times New Roman" w:cs="Times New Roman"/>
-          <w:sz w:val="24"/>
-          <w:szCs w:val="24"/>
-          <w:lang w:val="en-US"/>
-        </w:rPr>
-        <w:t>has</w:t>
-      </w:r>
-      <w:r>
-        <w:rPr>
-          <w:rFonts w:ascii="Times New Roman" w:hAnsi="Times New Roman" w:cs="Times New Roman"/>
-          <w:sz w:val="24"/>
-          <w:szCs w:val="24"/>
-          <w:lang w:val="en-US"/>
-        </w:rPr>
-        <w:t xml:space="preserve"> an average price</w:t>
-      </w:r>
-      <w:r>
-        <w:rPr>
-          <w:rFonts w:ascii="Times New Roman" w:hAnsi="Times New Roman" w:cs="Times New Roman"/>
-          <w:sz w:val="24"/>
-          <w:szCs w:val="24"/>
-          <w:lang w:val="en-US"/>
-        </w:rPr>
-        <w:t xml:space="preserve"> also</w:t>
-      </w:r>
-      <w:r>
-        <w:rPr>
-          <w:rFonts w:ascii="Times New Roman" w:hAnsi="Times New Roman" w:cs="Times New Roman"/>
-          <w:sz w:val="24"/>
-          <w:szCs w:val="24"/>
-          <w:lang w:val="en-US"/>
-        </w:rPr>
-        <w:t xml:space="preserve"> slightly higher than the other </w:t>
-      </w:r>
-      <w:r>
-        <w:rPr>
-          <w:rFonts w:ascii="Times New Roman" w:hAnsi="Times New Roman" w:cs="Times New Roman"/>
-          <w:sz w:val="24"/>
-          <w:szCs w:val="24"/>
-          <w:lang w:val="en-US"/>
-        </w:rPr>
-        <w:t>fillings</w:t>
-      </w:r>
-      <w:r>
-        <w:rPr>
-          <w:rFonts w:ascii="Times New Roman" w:hAnsi="Times New Roman" w:cs="Times New Roman"/>
-          <w:sz w:val="24"/>
-          <w:szCs w:val="24"/>
-          <w:lang w:val="en-US"/>
-        </w:rPr>
-        <w:t>.</w:t>
+        <w:t>Regarding the cask filling, second fill has an average price also slightly higher than the other fillings.</w:t>
       </w:r>
     </w:p>
     <w:p>
@@ -1507,27 +1358,7 @@
           <w:szCs w:val="24"/>
           <w:lang w:val="en-US"/>
         </w:rPr>
-        <w:t xml:space="preserve">The </w:t>
-      </w:r>
-      <w:proofErr w:type="spellStart"/>
-      <w:r>
-        <w:rPr>
-          <w:rFonts w:ascii="Times New Roman" w:hAnsi="Times New Roman" w:cs="Times New Roman"/>
-          <w:sz w:val="24"/>
-          <w:szCs w:val="24"/>
-          <w:lang w:val="en-US"/>
-        </w:rPr>
-        <w:t>NaN</w:t>
-      </w:r>
-      <w:proofErr w:type="spellEnd"/>
-      <w:r>
-        <w:rPr>
-          <w:rFonts w:ascii="Times New Roman" w:hAnsi="Times New Roman" w:cs="Times New Roman"/>
-          <w:sz w:val="24"/>
-          <w:szCs w:val="24"/>
-          <w:lang w:val="en-US"/>
-        </w:rPr>
-        <w:t xml:space="preserve"> values were replaced by “Undisclosed” in </w:t>
+        <w:t xml:space="preserve">The NaN values were replaced by “Undisclosed” in </w:t>
       </w:r>
       <w:r>
         <w:rPr>
@@ -1683,7 +1514,6 @@
           <w:lang w:val="en-US"/>
         </w:rPr>
       </w:pPr>
-      <w:proofErr w:type="spellStart"/>
       <w:r>
         <w:rPr>
           <w:rFonts w:ascii="Times New Roman" w:hAnsi="Times New Roman" w:cs="Times New Roman"/>
@@ -1693,7 +1523,6 @@
         </w:rPr>
         <w:t>distillery_status</w:t>
       </w:r>
-      <w:proofErr w:type="spellEnd"/>
       <w:r>
         <w:rPr>
           <w:rFonts w:ascii="Times New Roman" w:hAnsi="Times New Roman" w:cs="Times New Roman"/>
@@ -1719,7 +1548,6 @@
           <w:lang w:val="en-US"/>
         </w:rPr>
       </w:pPr>
-      <w:proofErr w:type="spellStart"/>
       <w:r>
         <w:rPr>
           <w:rFonts w:ascii="Times New Roman" w:hAnsi="Times New Roman" w:cs="Times New Roman"/>
@@ -1729,7 +1557,6 @@
         </w:rPr>
         <w:t>cask_type</w:t>
       </w:r>
-      <w:proofErr w:type="spellEnd"/>
       <w:r>
         <w:rPr>
           <w:rFonts w:ascii="Times New Roman" w:hAnsi="Times New Roman" w:cs="Times New Roman"/>
@@ -1755,7 +1582,6 @@
           <w:lang w:val="en-US"/>
         </w:rPr>
       </w:pPr>
-      <w:proofErr w:type="spellStart"/>
       <w:r>
         <w:rPr>
           <w:rFonts w:ascii="Times New Roman" w:hAnsi="Times New Roman" w:cs="Times New Roman"/>
@@ -1765,7 +1591,6 @@
         </w:rPr>
         <w:t>cask_filling</w:t>
       </w:r>
-      <w:proofErr w:type="spellEnd"/>
       <w:r>
         <w:rPr>
           <w:rFonts w:ascii="Times New Roman" w:hAnsi="Times New Roman" w:cs="Times New Roman"/>
@@ -1791,7 +1616,6 @@
           <w:lang w:val="en-US"/>
         </w:rPr>
       </w:pPr>
-      <w:proofErr w:type="spellStart"/>
       <w:r>
         <w:rPr>
           <w:rFonts w:ascii="Times New Roman" w:hAnsi="Times New Roman" w:cs="Times New Roman"/>
@@ -1801,7 +1625,6 @@
         </w:rPr>
         <w:t>previous_spirit</w:t>
       </w:r>
-      <w:proofErr w:type="spellEnd"/>
       <w:r>
         <w:rPr>
           <w:rFonts w:ascii="Times New Roman" w:hAnsi="Times New Roman" w:cs="Times New Roman"/>
@@ -2229,27 +2052,7 @@
           <w:szCs w:val="24"/>
           <w:lang w:val="en-US"/>
         </w:rPr>
-        <w:t xml:space="preserve">nflation adjusted hammer price per </w:t>
-      </w:r>
-      <w:proofErr w:type="spellStart"/>
-      <w:r>
-        <w:rPr>
-          <w:rFonts w:ascii="Times New Roman" w:hAnsi="Times New Roman" w:cs="Times New Roman"/>
-          <w:sz w:val="24"/>
-          <w:szCs w:val="24"/>
-          <w:lang w:val="en-US"/>
-        </w:rPr>
-        <w:t>litre</w:t>
-      </w:r>
-      <w:proofErr w:type="spellEnd"/>
-      <w:r>
-        <w:rPr>
-          <w:rFonts w:ascii="Times New Roman" w:hAnsi="Times New Roman" w:cs="Times New Roman"/>
-          <w:sz w:val="24"/>
-          <w:szCs w:val="24"/>
-          <w:lang w:val="en-US"/>
-        </w:rPr>
-        <w:t xml:space="preserve"> of alcohol</w:t>
+        <w:t>nflation adjusted hammer price per litre of alcohol</w:t>
       </w:r>
       <w:r>
         <w:rPr>
@@ -2483,27 +2286,7 @@
           <w:szCs w:val="24"/>
           <w:lang w:val="en-US"/>
         </w:rPr>
-        <w:t xml:space="preserve">Inflation adjusted hammer price per </w:t>
-      </w:r>
-      <w:proofErr w:type="spellStart"/>
-      <w:r>
-        <w:rPr>
-          <w:rFonts w:ascii="Times New Roman" w:hAnsi="Times New Roman" w:cs="Times New Roman"/>
-          <w:sz w:val="24"/>
-          <w:szCs w:val="24"/>
-          <w:lang w:val="en-US"/>
-        </w:rPr>
-        <w:t>litre</w:t>
-      </w:r>
-      <w:proofErr w:type="spellEnd"/>
-      <w:r>
-        <w:rPr>
-          <w:rFonts w:ascii="Times New Roman" w:hAnsi="Times New Roman" w:cs="Times New Roman"/>
-          <w:sz w:val="24"/>
-          <w:szCs w:val="24"/>
-          <w:lang w:val="en-US"/>
-        </w:rPr>
-        <w:t xml:space="preserve"> of alcohol</w:t>
+        <w:t>Inflation adjusted hammer price per litre of alcohol</w:t>
       </w:r>
     </w:p>
     <w:p>
@@ -2564,27 +2347,7 @@
           <w:szCs w:val="24"/>
           <w:lang w:val="en-US"/>
         </w:rPr>
-        <w:t xml:space="preserve"> per </w:t>
-      </w:r>
-      <w:proofErr w:type="spellStart"/>
-      <w:r>
-        <w:rPr>
-          <w:rFonts w:ascii="Times New Roman" w:hAnsi="Times New Roman" w:cs="Times New Roman"/>
-          <w:sz w:val="24"/>
-          <w:szCs w:val="24"/>
-          <w:lang w:val="en-US"/>
-        </w:rPr>
-        <w:t>litre</w:t>
-      </w:r>
-      <w:proofErr w:type="spellEnd"/>
-      <w:r>
-        <w:rPr>
-          <w:rFonts w:ascii="Times New Roman" w:hAnsi="Times New Roman" w:cs="Times New Roman"/>
-          <w:sz w:val="24"/>
-          <w:szCs w:val="24"/>
-          <w:lang w:val="en-US"/>
-        </w:rPr>
-        <w:t xml:space="preserve"> of alcohol per age</w:t>
+        <w:t xml:space="preserve"> per litre of alcohol per age</w:t>
       </w:r>
     </w:p>
     <w:p>
@@ -2613,36 +2376,16 @@
           <w:szCs w:val="24"/>
           <w:lang w:val="en-US"/>
         </w:rPr>
-        <w:t xml:space="preserve"> Y </w:t>
-      </w:r>
-      <w:proofErr w:type="gramStart"/>
-      <w:r>
-        <w:rPr>
-          <w:rFonts w:ascii="Times New Roman" w:hAnsi="Times New Roman" w:cs="Times New Roman"/>
-          <w:sz w:val="24"/>
-          <w:szCs w:val="24"/>
-          <w:lang w:val="en-US"/>
-        </w:rPr>
-        <w:t>variables</w:t>
-      </w:r>
-      <w:r>
-        <w:rPr>
-          <w:rFonts w:ascii="Times New Roman" w:hAnsi="Times New Roman" w:cs="Times New Roman"/>
-          <w:sz w:val="24"/>
-          <w:szCs w:val="24"/>
-          <w:lang w:val="en-US"/>
-        </w:rPr>
-        <w:t>, and</w:t>
-      </w:r>
-      <w:proofErr w:type="gramEnd"/>
-      <w:r>
-        <w:rPr>
-          <w:rFonts w:ascii="Times New Roman" w:hAnsi="Times New Roman" w:cs="Times New Roman"/>
-          <w:sz w:val="24"/>
-          <w:szCs w:val="24"/>
-          <w:lang w:val="en-US"/>
-        </w:rPr>
-        <w:t xml:space="preserve"> evaluated through the Shapiro-Wilk test.</w:t>
+        <w:t xml:space="preserve"> Y variables</w:t>
+      </w:r>
+      <w:r>
+        <w:rPr>
+          <w:rFonts w:ascii="Times New Roman" w:hAnsi="Times New Roman" w:cs="Times New Roman"/>
+          <w:sz w:val="24"/>
+          <w:szCs w:val="24"/>
+          <w:lang w:val="en-US"/>
+        </w:rPr>
+        <w:t>, and evaluated through the Shapiro-Wilk test.</w:t>
       </w:r>
     </w:p>
     <w:p>
@@ -2704,22 +2447,8 @@
                 <w:sz w:val="19"/>
                 <w:szCs w:val="19"/>
               </w:rPr>
-              <w:t>P-</w:t>
+              <w:t>P-value</w:t>
             </w:r>
-            <w:proofErr w:type="spellStart"/>
-            <w:proofErr w:type="gramStart"/>
-            <w:r>
-              <w:rPr>
-                <w:rFonts w:ascii="Times New Roman" w:hAnsi="Times New Roman" w:cs="Times New Roman"/>
-                <w:b/>
-                <w:bCs/>
-                <w:sz w:val="19"/>
-                <w:szCs w:val="19"/>
-              </w:rPr>
-              <w:t>value</w:t>
-            </w:r>
-            <w:proofErr w:type="spellEnd"/>
-            <w:proofErr w:type="gramEnd"/>
           </w:p>
         </w:tc>
         <w:tc>
@@ -2738,7 +2467,6 @@
                 <w:szCs w:val="19"/>
               </w:rPr>
             </w:pPr>
-            <w:proofErr w:type="spellStart"/>
             <w:r>
               <w:rPr>
                 <w:rFonts w:ascii="Times New Roman" w:hAnsi="Times New Roman" w:cs="Times New Roman"/>
@@ -2749,7 +2477,6 @@
               </w:rPr>
               <w:t>Interpretation</w:t>
             </w:r>
-            <w:proofErr w:type="spellEnd"/>
           </w:p>
         </w:tc>
         <w:tc>
@@ -2768,7 +2495,6 @@
                 <w:szCs w:val="19"/>
               </w:rPr>
             </w:pPr>
-            <w:proofErr w:type="spellStart"/>
             <w:r>
               <w:rPr>
                 <w:rFonts w:ascii="Times New Roman" w:hAnsi="Times New Roman" w:cs="Times New Roman"/>
@@ -2779,7 +2505,6 @@
               </w:rPr>
               <w:t>Conclusion</w:t>
             </w:r>
-            <w:proofErr w:type="spellEnd"/>
           </w:p>
         </w:tc>
       </w:tr>
@@ -2829,59 +2554,13 @@
                 <w:szCs w:val="19"/>
               </w:rPr>
             </w:pPr>
-            <w:proofErr w:type="spellStart"/>
             <w:r>
               <w:rPr>
                 <w:rFonts w:ascii="Times New Roman" w:hAnsi="Times New Roman" w:cs="Times New Roman"/>
                 <w:sz w:val="19"/>
                 <w:szCs w:val="19"/>
               </w:rPr>
-              <w:t>Fail</w:t>
-            </w:r>
-            <w:proofErr w:type="spellEnd"/>
-            <w:r>
-              <w:rPr>
-                <w:rFonts w:ascii="Times New Roman" w:hAnsi="Times New Roman" w:cs="Times New Roman"/>
-                <w:sz w:val="19"/>
-                <w:szCs w:val="19"/>
-              </w:rPr>
-              <w:t xml:space="preserve"> </w:t>
-            </w:r>
-            <w:proofErr w:type="spellStart"/>
-            <w:r>
-              <w:rPr>
-                <w:rFonts w:ascii="Times New Roman" w:hAnsi="Times New Roman" w:cs="Times New Roman"/>
-                <w:sz w:val="19"/>
-                <w:szCs w:val="19"/>
-              </w:rPr>
-              <w:t>to</w:t>
-            </w:r>
-            <w:proofErr w:type="spellEnd"/>
-            <w:r>
-              <w:rPr>
-                <w:rFonts w:ascii="Times New Roman" w:hAnsi="Times New Roman" w:cs="Times New Roman"/>
-                <w:sz w:val="19"/>
-                <w:szCs w:val="19"/>
-              </w:rPr>
-              <w:t xml:space="preserve"> </w:t>
-            </w:r>
-            <w:proofErr w:type="spellStart"/>
-            <w:r>
-              <w:rPr>
-                <w:rFonts w:ascii="Times New Roman" w:hAnsi="Times New Roman" w:cs="Times New Roman"/>
-                <w:sz w:val="19"/>
-                <w:szCs w:val="19"/>
-              </w:rPr>
-              <w:t>reject</w:t>
-            </w:r>
-            <w:proofErr w:type="spellEnd"/>
-            <w:r>
-              <w:rPr>
-                <w:rFonts w:ascii="Times New Roman" w:hAnsi="Times New Roman" w:cs="Times New Roman"/>
-                <w:sz w:val="19"/>
-                <w:szCs w:val="19"/>
-              </w:rPr>
-              <w:t xml:space="preserve"> H0</w:t>
+              <w:t>Fail to reject H0</w:t>
             </w:r>
           </w:p>
         </w:tc>
@@ -2907,27 +2586,8 @@
                 <w:sz w:val="19"/>
                 <w:szCs w:val="19"/>
               </w:rPr>
-              <w:t xml:space="preserve">Data </w:t>
+              <w:t xml:space="preserve">Data is </w:t>
             </w:r>
-            <w:proofErr w:type="spellStart"/>
-            <w:r>
-              <w:rPr>
-                <w:rFonts w:ascii="Times New Roman" w:hAnsi="Times New Roman" w:cs="Times New Roman"/>
-                <w:sz w:val="19"/>
-                <w:szCs w:val="19"/>
-              </w:rPr>
-              <w:t>is</w:t>
-            </w:r>
-            <w:proofErr w:type="spellEnd"/>
-            <w:r>
-              <w:rPr>
-                <w:rFonts w:ascii="Times New Roman" w:hAnsi="Times New Roman" w:cs="Times New Roman"/>
-                <w:sz w:val="19"/>
-                <w:szCs w:val="19"/>
-              </w:rPr>
-              <w:t xml:space="preserve"> </w:t>
-            </w:r>
-            <w:proofErr w:type="spellStart"/>
             <w:r>
               <w:rPr>
                 <w:rFonts w:ascii="Times New Roman" w:hAnsi="Times New Roman" w:cs="Times New Roman"/>
@@ -2936,31 +2596,8 @@
                 <w:sz w:val="19"/>
                 <w:szCs w:val="19"/>
               </w:rPr>
-              <w:t>normally</w:t>
+              <w:t>normally distributed</w:t>
             </w:r>
-            <w:proofErr w:type="spellEnd"/>
-            <w:r>
-              <w:rPr>
-                <w:rFonts w:ascii="Times New Roman" w:hAnsi="Times New Roman" w:cs="Times New Roman"/>
-                <w:b/>
-                <w:bCs/>
-                <w:sz w:val="19"/>
-                <w:szCs w:val="19"/>
-              </w:rPr>
-              <w:t xml:space="preserve"> </w:t>
-            </w:r>
-            <w:proofErr w:type="spellStart"/>
-            <w:r>
-              <w:rPr>
-                <w:rFonts w:ascii="Times New Roman" w:hAnsi="Times New Roman" w:cs="Times New Roman"/>
-                <w:b/>
-                <w:bCs/>
-                <w:sz w:val="19"/>
-                <w:szCs w:val="19"/>
-              </w:rPr>
-              <w:t>distributed</w:t>
-            </w:r>
-            <w:proofErr w:type="spellEnd"/>
             <w:r>
               <w:rPr>
                 <w:rFonts w:ascii="Times New Roman" w:hAnsi="Times New Roman" w:cs="Times New Roman"/>
@@ -3018,23 +2655,13 @@
                 <w:szCs w:val="19"/>
               </w:rPr>
             </w:pPr>
-            <w:proofErr w:type="spellStart"/>
             <w:r>
               <w:rPr>
                 <w:rFonts w:ascii="Times New Roman" w:hAnsi="Times New Roman" w:cs="Times New Roman"/>
                 <w:sz w:val="19"/>
                 <w:szCs w:val="19"/>
               </w:rPr>
-              <w:t>Reject</w:t>
-            </w:r>
-            <w:proofErr w:type="spellEnd"/>
-            <w:r>
-              <w:rPr>
-                <w:rFonts w:ascii="Times New Roman" w:hAnsi="Times New Roman" w:cs="Times New Roman"/>
-                <w:sz w:val="19"/>
-                <w:szCs w:val="19"/>
-              </w:rPr>
-              <w:t xml:space="preserve"> H0</w:t>
+              <w:t>Reject H0</w:t>
             </w:r>
           </w:p>
         </w:tc>
@@ -3449,18 +3076,8 @@
                 <w:sz w:val="19"/>
                 <w:szCs w:val="19"/>
               </w:rPr>
-              <w:t xml:space="preserve">y </w:t>
+              <w:t>y column</w:t>
             </w:r>
-            <w:proofErr w:type="spellStart"/>
-            <w:r>
-              <w:rPr>
-                <w:rFonts w:ascii="Times New Roman" w:hAnsi="Times New Roman" w:cs="Times New Roman"/>
-                <w:sz w:val="19"/>
-                <w:szCs w:val="19"/>
-              </w:rPr>
-              <w:t>column</w:t>
-            </w:r>
-            <w:proofErr w:type="spellEnd"/>
           </w:p>
         </w:tc>
         <w:tc>
@@ -3484,18 +3101,8 @@
                 <w:sz w:val="19"/>
                 <w:szCs w:val="19"/>
               </w:rPr>
-              <w:t xml:space="preserve">x </w:t>
+              <w:t>x column</w:t>
             </w:r>
-            <w:proofErr w:type="spellStart"/>
-            <w:r>
-              <w:rPr>
-                <w:rFonts w:ascii="Times New Roman" w:hAnsi="Times New Roman" w:cs="Times New Roman"/>
-                <w:sz w:val="19"/>
-                <w:szCs w:val="19"/>
-              </w:rPr>
-              <w:t>column</w:t>
-            </w:r>
-            <w:proofErr w:type="spellEnd"/>
           </w:p>
         </w:tc>
         <w:tc>
@@ -3518,18 +3125,8 @@
                 <w:sz w:val="19"/>
                 <w:szCs w:val="19"/>
               </w:rPr>
-              <w:t xml:space="preserve">y </w:t>
+              <w:t>y transformation</w:t>
             </w:r>
-            <w:proofErr w:type="spellStart"/>
-            <w:r>
-              <w:rPr>
-                <w:rFonts w:ascii="Times New Roman" w:hAnsi="Times New Roman" w:cs="Times New Roman"/>
-                <w:sz w:val="19"/>
-                <w:szCs w:val="19"/>
-              </w:rPr>
-              <w:t>transformation</w:t>
-            </w:r>
-            <w:proofErr w:type="spellEnd"/>
           </w:p>
         </w:tc>
         <w:tc>
@@ -3552,18 +3149,8 @@
                 <w:sz w:val="19"/>
                 <w:szCs w:val="19"/>
               </w:rPr>
-              <w:t xml:space="preserve">x </w:t>
+              <w:t>x transformation</w:t>
             </w:r>
-            <w:proofErr w:type="spellStart"/>
-            <w:r>
-              <w:rPr>
-                <w:rFonts w:ascii="Times New Roman" w:hAnsi="Times New Roman" w:cs="Times New Roman"/>
-                <w:sz w:val="19"/>
-                <w:szCs w:val="19"/>
-              </w:rPr>
-              <w:t>transformation</w:t>
-            </w:r>
-            <w:proofErr w:type="spellEnd"/>
           </w:p>
         </w:tc>
         <w:tc>
@@ -3581,7 +3168,6 @@
                 <w:lang w:val="en-US"/>
               </w:rPr>
             </w:pPr>
-            <w:proofErr w:type="spellStart"/>
             <w:r>
               <w:rPr>
                 <w:rFonts w:ascii="Times New Roman" w:hAnsi="Times New Roman" w:cs="Times New Roman"/>
@@ -3590,7 +3176,6 @@
               </w:rPr>
               <w:t>correlation</w:t>
             </w:r>
-            <w:proofErr w:type="spellEnd"/>
           </w:p>
         </w:tc>
       </w:tr>
@@ -3610,7 +3195,6 @@
                 <w:lang w:val="en-US"/>
               </w:rPr>
             </w:pPr>
-            <w:proofErr w:type="spellStart"/>
             <w:r>
               <w:rPr>
                 <w:rFonts w:ascii="Times New Roman" w:hAnsi="Times New Roman" w:cs="Times New Roman"/>
@@ -3620,7 +3204,6 @@
               </w:rPr>
               <w:t>inf_adj_hammer_price_per_litre_of_alcohol</w:t>
             </w:r>
-            <w:proofErr w:type="spellEnd"/>
           </w:p>
         </w:tc>
         <w:tc>
@@ -3688,7 +3271,6 @@
                 <w:lang w:val="en-US"/>
               </w:rPr>
             </w:pPr>
-            <w:proofErr w:type="spellStart"/>
             <w:r>
               <w:rPr>
                 <w:rFonts w:ascii="Times New Roman" w:hAnsi="Times New Roman" w:cs="Times New Roman"/>
@@ -3697,7 +3279,6 @@
               </w:rPr>
               <w:t>None</w:t>
             </w:r>
-            <w:proofErr w:type="spellEnd"/>
           </w:p>
         </w:tc>
         <w:tc>
@@ -3758,7 +3339,6 @@
                 <w:lang w:val="en-US"/>
               </w:rPr>
             </w:pPr>
-            <w:proofErr w:type="spellStart"/>
             <w:r>
               <w:rPr>
                 <w:rFonts w:ascii="Times New Roman" w:hAnsi="Times New Roman" w:cs="Times New Roman"/>
@@ -3768,7 +3348,6 @@
               </w:rPr>
               <w:t>inf_adj_hammer_price_per_litre_of_alcohol</w:t>
             </w:r>
-            <w:proofErr w:type="spellEnd"/>
           </w:p>
         </w:tc>
         <w:tc>
@@ -3786,7 +3365,6 @@
                 <w:lang w:val="en-US"/>
               </w:rPr>
             </w:pPr>
-            <w:proofErr w:type="spellStart"/>
             <w:r>
               <w:rPr>
                 <w:rFonts w:ascii="Times New Roman" w:hAnsi="Times New Roman" w:cs="Times New Roman"/>
@@ -3795,7 +3373,6 @@
               </w:rPr>
               <w:t>strength</w:t>
             </w:r>
-            <w:proofErr w:type="spellEnd"/>
           </w:p>
         </w:tc>
         <w:tc>
@@ -3838,7 +3415,6 @@
                 <w:lang w:val="en-US"/>
               </w:rPr>
             </w:pPr>
-            <w:proofErr w:type="spellStart"/>
             <w:r>
               <w:rPr>
                 <w:rFonts w:ascii="Times New Roman" w:hAnsi="Times New Roman" w:cs="Times New Roman"/>
@@ -3847,7 +3423,6 @@
               </w:rPr>
               <w:t>None</w:t>
             </w:r>
-            <w:proofErr w:type="spellEnd"/>
           </w:p>
         </w:tc>
         <w:tc>
@@ -3892,7 +3467,6 @@
                 <w:lang w:val="en-US"/>
               </w:rPr>
             </w:pPr>
-            <w:proofErr w:type="spellStart"/>
             <w:r>
               <w:rPr>
                 <w:rFonts w:ascii="Times New Roman" w:hAnsi="Times New Roman" w:cs="Times New Roman"/>
@@ -3902,7 +3476,6 @@
               </w:rPr>
               <w:t>inf_adj_hammer_price_per_litre_of_alcohol_per_age</w:t>
             </w:r>
-            <w:proofErr w:type="spellEnd"/>
           </w:p>
         </w:tc>
         <w:tc>
@@ -3920,7 +3493,6 @@
                 <w:lang w:val="en-US"/>
               </w:rPr>
             </w:pPr>
-            <w:proofErr w:type="spellStart"/>
             <w:r>
               <w:rPr>
                 <w:rFonts w:ascii="Times New Roman" w:hAnsi="Times New Roman" w:cs="Times New Roman"/>
@@ -3929,7 +3501,6 @@
               </w:rPr>
               <w:t>rla</w:t>
             </w:r>
-            <w:proofErr w:type="spellEnd"/>
           </w:p>
         </w:tc>
         <w:tc>
@@ -4024,7 +3595,6 @@
                 <w:lang w:val="en-US"/>
               </w:rPr>
             </w:pPr>
-            <w:proofErr w:type="spellStart"/>
             <w:r>
               <w:rPr>
                 <w:rFonts w:ascii="Times New Roman" w:hAnsi="Times New Roman" w:cs="Times New Roman"/>
@@ -4034,7 +3604,6 @@
               </w:rPr>
               <w:t>inf_adj_hammer_price_per_age</w:t>
             </w:r>
-            <w:proofErr w:type="spellEnd"/>
           </w:p>
         </w:tc>
         <w:tc>
@@ -4052,7 +3621,6 @@
                 <w:lang w:val="en-US"/>
               </w:rPr>
             </w:pPr>
-            <w:proofErr w:type="spellStart"/>
             <w:r>
               <w:rPr>
                 <w:rFonts w:ascii="Times New Roman" w:hAnsi="Times New Roman" w:cs="Times New Roman"/>
@@ -4061,7 +3629,6 @@
               </w:rPr>
               <w:t>bottles_at_cask_strength</w:t>
             </w:r>
-            <w:proofErr w:type="spellEnd"/>
           </w:p>
         </w:tc>
         <w:tc>
@@ -4079,7 +3646,6 @@
                 <w:lang w:val="en-US"/>
               </w:rPr>
             </w:pPr>
-            <w:proofErr w:type="spellStart"/>
             <w:r>
               <w:rPr>
                 <w:rFonts w:ascii="Times New Roman" w:hAnsi="Times New Roman" w:cs="Times New Roman"/>
@@ -4088,7 +3654,6 @@
               </w:rPr>
               <w:t>None</w:t>
             </w:r>
-            <w:proofErr w:type="spellEnd"/>
           </w:p>
         </w:tc>
         <w:tc>
@@ -4106,7 +3671,6 @@
                 <w:lang w:val="en-US"/>
               </w:rPr>
             </w:pPr>
-            <w:proofErr w:type="spellStart"/>
             <w:r>
               <w:rPr>
                 <w:rFonts w:ascii="Times New Roman" w:hAnsi="Times New Roman" w:cs="Times New Roman"/>
@@ -4115,7 +3679,6 @@
               </w:rPr>
               <w:t>None</w:t>
             </w:r>
-            <w:proofErr w:type="spellEnd"/>
           </w:p>
         </w:tc>
         <w:tc>
@@ -4168,7 +3731,6 @@
                 <w:lang w:val="en-US"/>
               </w:rPr>
             </w:pPr>
-            <w:proofErr w:type="spellStart"/>
             <w:r>
               <w:rPr>
                 <w:rFonts w:ascii="Times New Roman" w:hAnsi="Times New Roman" w:cs="Times New Roman"/>
@@ -4178,7 +3740,6 @@
               </w:rPr>
               <w:t>inf_adj_hammer_price_per_age</w:t>
             </w:r>
-            <w:proofErr w:type="spellEnd"/>
           </w:p>
         </w:tc>
         <w:tc>
@@ -4196,7 +3757,6 @@
                 <w:lang w:val="en-US"/>
               </w:rPr>
             </w:pPr>
-            <w:proofErr w:type="spellStart"/>
             <w:r>
               <w:rPr>
                 <w:rFonts w:ascii="Times New Roman" w:hAnsi="Times New Roman" w:cs="Times New Roman"/>
@@ -4205,7 +3765,6 @@
               </w:rPr>
               <w:t>bulk_litres</w:t>
             </w:r>
-            <w:proofErr w:type="spellEnd"/>
           </w:p>
         </w:tc>
         <w:tc>
@@ -4223,7 +3782,6 @@
                 <w:lang w:val="en-US"/>
               </w:rPr>
             </w:pPr>
-            <w:proofErr w:type="spellStart"/>
             <w:r>
               <w:rPr>
                 <w:rFonts w:ascii="Times New Roman" w:hAnsi="Times New Roman" w:cs="Times New Roman"/>
@@ -4232,7 +3790,6 @@
               </w:rPr>
               <w:t>None</w:t>
             </w:r>
-            <w:proofErr w:type="spellEnd"/>
           </w:p>
         </w:tc>
         <w:tc>
@@ -4250,7 +3807,6 @@
                 <w:lang w:val="en-US"/>
               </w:rPr>
             </w:pPr>
-            <w:proofErr w:type="spellStart"/>
             <w:r>
               <w:rPr>
                 <w:rFonts w:ascii="Times New Roman" w:hAnsi="Times New Roman" w:cs="Times New Roman"/>
@@ -4259,7 +3815,6 @@
               </w:rPr>
               <w:t>None</w:t>
             </w:r>
-            <w:proofErr w:type="spellEnd"/>
           </w:p>
         </w:tc>
         <w:tc>
@@ -4312,7 +3867,6 @@
                 <w:lang w:val="en-US"/>
               </w:rPr>
             </w:pPr>
-            <w:proofErr w:type="spellStart"/>
             <w:r>
               <w:rPr>
                 <w:rFonts w:ascii="Times New Roman" w:hAnsi="Times New Roman" w:cs="Times New Roman"/>
@@ -4322,7 +3876,6 @@
               </w:rPr>
               <w:t>inf_adj_hammer_price_per_litre_of_alcohol</w:t>
             </w:r>
-            <w:proofErr w:type="spellEnd"/>
           </w:p>
         </w:tc>
         <w:tc>
@@ -4442,7 +3995,6 @@
                 <w:lang w:val="en-US"/>
               </w:rPr>
             </w:pPr>
-            <w:proofErr w:type="spellStart"/>
             <w:r>
               <w:rPr>
                 <w:rFonts w:ascii="Times New Roman" w:hAnsi="Times New Roman" w:cs="Times New Roman"/>
@@ -4451,7 +4003,6 @@
               </w:rPr>
               <w:t>inf_adj_hammer_price</w:t>
             </w:r>
-            <w:proofErr w:type="spellEnd"/>
           </w:p>
         </w:tc>
         <w:tc>
@@ -4571,7 +4122,6 @@
                 <w:lang w:val="en-US"/>
               </w:rPr>
             </w:pPr>
-            <w:proofErr w:type="spellStart"/>
             <w:r>
               <w:rPr>
                 <w:rFonts w:ascii="Times New Roman" w:hAnsi="Times New Roman" w:cs="Times New Roman"/>
@@ -4580,7 +4130,6 @@
               </w:rPr>
               <w:t>inf_adj_hammer_price</w:t>
             </w:r>
-            <w:proofErr w:type="spellEnd"/>
           </w:p>
         </w:tc>
         <w:tc>
@@ -4648,7 +4197,6 @@
                 <w:lang w:val="en-US"/>
               </w:rPr>
             </w:pPr>
-            <w:proofErr w:type="spellStart"/>
             <w:r>
               <w:rPr>
                 <w:rFonts w:ascii="Times New Roman" w:hAnsi="Times New Roman" w:cs="Times New Roman"/>
@@ -4657,7 +4205,6 @@
               </w:rPr>
               <w:t>None</w:t>
             </w:r>
-            <w:proofErr w:type="spellEnd"/>
           </w:p>
         </w:tc>
         <w:tc>
@@ -4714,27 +4261,7 @@
           <w:szCs w:val="24"/>
           <w:lang w:val="en-US"/>
         </w:rPr>
-        <w:t xml:space="preserve">nflation adjusted hammer price per </w:t>
-      </w:r>
-      <w:proofErr w:type="spellStart"/>
-      <w:r>
-        <w:rPr>
-          <w:rFonts w:ascii="Times New Roman" w:hAnsi="Times New Roman" w:cs="Times New Roman"/>
-          <w:sz w:val="24"/>
-          <w:szCs w:val="24"/>
-          <w:lang w:val="en-US"/>
-        </w:rPr>
-        <w:t>litre</w:t>
-      </w:r>
-      <w:proofErr w:type="spellEnd"/>
-      <w:r>
-        <w:rPr>
-          <w:rFonts w:ascii="Times New Roman" w:hAnsi="Times New Roman" w:cs="Times New Roman"/>
-          <w:sz w:val="24"/>
-          <w:szCs w:val="24"/>
-          <w:lang w:val="en-US"/>
-        </w:rPr>
-        <w:t xml:space="preserve"> of alcohol is the only analyzed Y variable with high correlation (above 0.5) in relation to at least one X variable.</w:t>
+        <w:t>nflation adjusted hammer price per litre of alcohol is the only analyzed Y variable with high correlation (above 0.5) in relation to at least one X variable.</w:t>
       </w:r>
     </w:p>
     <w:p>
@@ -5000,27 +4527,7 @@
           <w:szCs w:val="24"/>
           <w:lang w:val="en-US"/>
         </w:rPr>
-        <w:t xml:space="preserve">Moreover, as inflation adjusted hammer price per </w:t>
-      </w:r>
-      <w:proofErr w:type="spellStart"/>
-      <w:r>
-        <w:rPr>
-          <w:rFonts w:ascii="Times New Roman" w:hAnsi="Times New Roman" w:cs="Times New Roman"/>
-          <w:sz w:val="24"/>
-          <w:szCs w:val="24"/>
-          <w:lang w:val="en-US"/>
-        </w:rPr>
-        <w:t>litre</w:t>
-      </w:r>
-      <w:proofErr w:type="spellEnd"/>
-      <w:r>
-        <w:rPr>
-          <w:rFonts w:ascii="Times New Roman" w:hAnsi="Times New Roman" w:cs="Times New Roman"/>
-          <w:sz w:val="24"/>
-          <w:szCs w:val="24"/>
-          <w:lang w:val="en-US"/>
-        </w:rPr>
-        <w:t xml:space="preserve"> of alcohol is the only analyzed Y variable with high correlation (above 0.5) in relation to at least one X variable, it’s the only one selected.</w:t>
+        <w:t>Moreover, as inflation adjusted hammer price per litre of alcohol is the only analyzed Y variable with high correlation (above 0.5) in relation to at least one X variable, it’s the only one selected.</w:t>
       </w:r>
     </w:p>
     <w:p>
@@ -5113,7 +4620,7 @@
           <w:szCs w:val="24"/>
           <w:lang w:val="en-US"/>
         </w:rPr>
-        <w:t>Strength.</w:t>
+        <w:t>Distillery.</w:t>
       </w:r>
     </w:p>
     <w:p>
@@ -5138,7 +4645,7 @@
           <w:szCs w:val="24"/>
           <w:lang w:val="en-US"/>
         </w:rPr>
-        <w:t>Distillery.</w:t>
+        <w:t>Region.</w:t>
       </w:r>
     </w:p>
     <w:p>
@@ -5163,7 +4670,7 @@
           <w:szCs w:val="24"/>
           <w:lang w:val="en-US"/>
         </w:rPr>
-        <w:t>Region.</w:t>
+        <w:t>Cask type.</w:t>
       </w:r>
     </w:p>
     <w:p>
@@ -5188,7 +4695,7 @@
           <w:szCs w:val="24"/>
           <w:lang w:val="en-US"/>
         </w:rPr>
-        <w:t>Cask type.</w:t>
+        <w:t>Cask filling.</w:t>
       </w:r>
     </w:p>
     <w:p>
@@ -5213,31 +4720,6 @@
           <w:szCs w:val="24"/>
           <w:lang w:val="en-US"/>
         </w:rPr>
-        <w:t>Cask filling.</w:t>
-      </w:r>
-    </w:p>
-    <w:p>
-      <w:pPr>
-        <w:pStyle w:val="ListParagraph"/>
-        <w:numPr>
-          <w:ilvl w:val="0"/>
-          <w:numId w:val="4"/>
-        </w:numPr>
-        <w:jc w:val="both"/>
-        <w:rPr>
-          <w:rFonts w:ascii="Times New Roman" w:hAnsi="Times New Roman" w:cs="Times New Roman"/>
-          <w:sz w:val="24"/>
-          <w:szCs w:val="24"/>
-          <w:lang w:val="en-US"/>
-        </w:rPr>
-      </w:pPr>
-      <w:r>
-        <w:rPr>
-          <w:rFonts w:ascii="Times New Roman" w:hAnsi="Times New Roman" w:cs="Times New Roman"/>
-          <w:sz w:val="24"/>
-          <w:szCs w:val="24"/>
-          <w:lang w:val="en-US"/>
-        </w:rPr>
         <w:t>I</w:t>
       </w:r>
       <w:r>
@@ -5247,27 +4729,7 @@
           <w:szCs w:val="24"/>
           <w:lang w:val="en-US"/>
         </w:rPr>
-        <w:t xml:space="preserve">nflation adjusted hammer price per </w:t>
-      </w:r>
-      <w:proofErr w:type="spellStart"/>
-      <w:r>
-        <w:rPr>
-          <w:rFonts w:ascii="Times New Roman" w:hAnsi="Times New Roman" w:cs="Times New Roman"/>
-          <w:sz w:val="24"/>
-          <w:szCs w:val="24"/>
-          <w:lang w:val="en-US"/>
-        </w:rPr>
-        <w:t>litre</w:t>
-      </w:r>
-      <w:proofErr w:type="spellEnd"/>
-      <w:r>
-        <w:rPr>
-          <w:rFonts w:ascii="Times New Roman" w:hAnsi="Times New Roman" w:cs="Times New Roman"/>
-          <w:sz w:val="24"/>
-          <w:szCs w:val="24"/>
-          <w:lang w:val="en-US"/>
-        </w:rPr>
-        <w:t xml:space="preserve"> of alcohol</w:t>
+        <w:t>nflation adjusted hammer price per litre of alcohol</w:t>
       </w:r>
       <w:r>
         <w:rPr>

</xml_diff>